<commit_message>
fix(subspaces): standardize clubs-activities-agent package, fix missing infographic and add visual video resources
</commit_message>
<xml_diff>
--- a/subspaces/02-student-services/clubs-activities-agent/info.docx
+++ b/subspaces/02-student-services/clubs-activities-agent/info.docx
@@ -8,14 +8,12 @@
       </w:pPr>
       <w:r>
         <w:rPr>
-          <w:rFonts w:ascii="Times New Roman" w:hAnsi="Times New Roman"/>
+          <w:rFonts w:ascii="Arial" w:hAnsi="Arial"/>
           <w:b/>
           <w:color w:val="003366"/>
-          <w:sz w:val="36"/>
+          <w:sz w:val="32"/>
         </w:rPr>
-        <w:t>HỒ SƠ THIẾT KẾ TRỢ LÝ AI: CLB &amp; HOẠT ĐỘNG NGOẠI KHÓA</w:t>
-        <w:br/>
-        <w:t>(CLUBS &amp; ACTIVITIES AGENT)</w:t>
+        <w:t>HỒ SƠ THIẾT KẾ AGENT: CLUBS &amp; ACTIVITIES AGENT</w:t>
       </w:r>
     </w:p>
     <w:p>
@@ -24,451 +22,618 @@
       </w:pPr>
       <w:r>
         <w:rPr>
-          <w:rFonts w:ascii="Times New Roman" w:hAnsi="Times New Roman"/>
+          <w:rFonts w:ascii="Arial" w:hAnsi="Arial"/>
           <w:i/>
-          <w:color w:val="666666"/>
-          <w:sz w:val="22"/>
+          <w:color w:val="646464"/>
+          <w:sz w:val="20"/>
         </w:rPr>
-        <w:t>Sub-space 02: Dịch vụ &amp; Hỗ trợ Sinh viên (Student Services Space) | Wesome AI Platform</w:t>
+        <w:t>HCMUS Smart Campus – Sub-space 02: Dịch vụ &amp; Hỗ trợ Sinh viên</w:t>
+        <w:br/>
+        <w:t>Track A – 2026 Global AI Agent Competition | Wesome AI Platform</w:t>
+      </w:r>
+    </w:p>
+    <w:p>
+      <w:r>
+        <w:rPr>
+          <w:rFonts w:ascii="Arial" w:hAnsi="Arial"/>
+          <w:b/>
+          <w:color w:val="003366"/>
+          <w:sz w:val="24"/>
+        </w:rPr>
+        <w:t>1. THÔNG TIN ĐỊNH DANH &amp; CẤU HÌNH CƠ BẢN</w:t>
+      </w:r>
+    </w:p>
+    <w:tbl>
+      <w:tblPr>
+        <w:tblW w:type="auto" w:w="0"/>
+        <w:jc w:val="center"/>
+        <w:tblLook w:firstColumn="1" w:firstRow="1" w:lastColumn="0" w:lastRow="0" w:noHBand="0" w:noVBand="1" w:val="04A0"/>
+      </w:tblPr>
+      <w:tblGrid>
+        <w:gridCol w:w="4824"/>
+        <w:gridCol w:w="4824"/>
+      </w:tblGrid>
+      <w:tr>
+        <w:tc>
+          <w:tcPr>
+            <w:tcW w:type="dxa" w:w="2880"/>
+            <w:shd w:val="clear" w:color="auto" w:fill="1B365D"/>
+            <w:tcMar>
+              <w:top w:w="120" w:type="dxa"/>
+              <w:bottom w:w="120" w:type="dxa"/>
+              <w:left w:w="150" w:type="dxa"/>
+              <w:right w:w="150" w:type="dxa"/>
+            </w:tcMar>
+          </w:tcPr>
+          <w:p>
+            <w:r>
+              <w:rPr>
+                <w:rFonts w:ascii="Arial" w:hAnsi="Arial"/>
+                <w:b/>
+                <w:color w:val="FFFFFF"/>
+                <w:sz w:val="20"/>
+              </w:rPr>
+              <w:t>Thuộc tính</w:t>
+            </w:r>
+          </w:p>
+        </w:tc>
+        <w:tc>
+          <w:tcPr>
+            <w:tcW w:type="dxa" w:w="6768"/>
+            <w:shd w:val="clear" w:color="auto" w:fill="1B365D"/>
+            <w:tcMar>
+              <w:top w:w="120" w:type="dxa"/>
+              <w:bottom w:w="120" w:type="dxa"/>
+              <w:left w:w="150" w:type="dxa"/>
+              <w:right w:w="150" w:type="dxa"/>
+            </w:tcMar>
+          </w:tcPr>
+          <w:p>
+            <w:r>
+              <w:rPr>
+                <w:rFonts w:ascii="Arial" w:hAnsi="Arial"/>
+                <w:b/>
+                <w:color w:val="FFFFFF"/>
+                <w:sz w:val="20"/>
+              </w:rPr>
+              <w:t>Giá trị cấu hình</w:t>
+            </w:r>
+          </w:p>
+        </w:tc>
+      </w:tr>
+      <w:tr>
+        <w:tc>
+          <w:tcPr>
+            <w:tcW w:type="dxa" w:w="2880"/>
+            <w:shd w:val="clear" w:color="auto" w:fill="F2F5F9"/>
+            <w:tcMar>
+              <w:top w:w="120" w:type="dxa"/>
+              <w:bottom w:w="120" w:type="dxa"/>
+              <w:left w:w="150" w:type="dxa"/>
+              <w:right w:w="150" w:type="dxa"/>
+            </w:tcMar>
+          </w:tcPr>
+          <w:p>
+            <w:r>
+              <w:rPr>
+                <w:rFonts w:ascii="Arial" w:hAnsi="Arial"/>
+                <w:b/>
+                <w:color w:val="1E1E1E"/>
+                <w:sz w:val="20"/>
+              </w:rPr>
+              <w:t>Tên Agent</w:t>
+            </w:r>
+          </w:p>
+        </w:tc>
+        <w:tc>
+          <w:tcPr>
+            <w:tcW w:type="dxa" w:w="6768"/>
+            <w:shd w:val="clear" w:color="auto" w:fill="F2F5F9"/>
+            <w:tcMar>
+              <w:top w:w="120" w:type="dxa"/>
+              <w:bottom w:w="120" w:type="dxa"/>
+              <w:left w:w="150" w:type="dxa"/>
+              <w:right w:w="150" w:type="dxa"/>
+            </w:tcMar>
+          </w:tcPr>
+          <w:p>
+            <w:r>
+              <w:rPr>
+                <w:rFonts w:ascii="Arial" w:hAnsi="Arial"/>
+                <w:color w:val="323232"/>
+                <w:sz w:val="20"/>
+              </w:rPr>
+              <w:t>Clubs &amp; Activities Agent (Trợ lý CLB &amp; Hoạt động Ngoại khóa)</w:t>
+            </w:r>
+          </w:p>
+        </w:tc>
+      </w:tr>
+      <w:tr>
+        <w:tc>
+          <w:tcPr>
+            <w:tcW w:type="dxa" w:w="2880"/>
+            <w:tcMar>
+              <w:top w:w="120" w:type="dxa"/>
+              <w:bottom w:w="120" w:type="dxa"/>
+              <w:left w:w="150" w:type="dxa"/>
+              <w:right w:w="150" w:type="dxa"/>
+            </w:tcMar>
+          </w:tcPr>
+          <w:p>
+            <w:r>
+              <w:rPr>
+                <w:rFonts w:ascii="Arial" w:hAnsi="Arial"/>
+                <w:b/>
+                <w:color w:val="1E1E1E"/>
+                <w:sz w:val="20"/>
+              </w:rPr>
+              <w:t>Mã định danh</w:t>
+            </w:r>
+          </w:p>
+        </w:tc>
+        <w:tc>
+          <w:tcPr>
+            <w:tcW w:type="dxa" w:w="6768"/>
+            <w:tcMar>
+              <w:top w:w="120" w:type="dxa"/>
+              <w:bottom w:w="120" w:type="dxa"/>
+              <w:left w:w="150" w:type="dxa"/>
+              <w:right w:w="150" w:type="dxa"/>
+            </w:tcMar>
+          </w:tcPr>
+          <w:p>
+            <w:r>
+              <w:rPr>
+                <w:rFonts w:ascii="Arial" w:hAnsi="Arial"/>
+                <w:color w:val="323232"/>
+                <w:sz w:val="20"/>
+              </w:rPr>
+              <w:t>clubs-activities-agent</w:t>
+            </w:r>
+          </w:p>
+        </w:tc>
+      </w:tr>
+      <w:tr>
+        <w:tc>
+          <w:tcPr>
+            <w:tcW w:type="dxa" w:w="2880"/>
+            <w:shd w:val="clear" w:color="auto" w:fill="F2F5F9"/>
+            <w:tcMar>
+              <w:top w:w="120" w:type="dxa"/>
+              <w:bottom w:w="120" w:type="dxa"/>
+              <w:left w:w="150" w:type="dxa"/>
+              <w:right w:w="150" w:type="dxa"/>
+            </w:tcMar>
+          </w:tcPr>
+          <w:p>
+            <w:r>
+              <w:rPr>
+                <w:rFonts w:ascii="Arial" w:hAnsi="Arial"/>
+                <w:b/>
+                <w:color w:val="1E1E1E"/>
+                <w:sz w:val="20"/>
+              </w:rPr>
+              <w:t>Không gian cha</w:t>
+            </w:r>
+          </w:p>
+        </w:tc>
+        <w:tc>
+          <w:tcPr>
+            <w:tcW w:type="dxa" w:w="6768"/>
+            <w:shd w:val="clear" w:color="auto" w:fill="F2F5F9"/>
+            <w:tcMar>
+              <w:top w:w="120" w:type="dxa"/>
+              <w:bottom w:w="120" w:type="dxa"/>
+              <w:left w:w="150" w:type="dxa"/>
+              <w:right w:w="150" w:type="dxa"/>
+            </w:tcMar>
+          </w:tcPr>
+          <w:p>
+            <w:r>
+              <w:rPr>
+                <w:rFonts w:ascii="Arial" w:hAnsi="Arial"/>
+                <w:color w:val="323232"/>
+                <w:sz w:val="20"/>
+              </w:rPr>
+              <w:t>HCMUS Smart Campus – AI University Life Hub</w:t>
+            </w:r>
+          </w:p>
+        </w:tc>
+      </w:tr>
+      <w:tr>
+        <w:tc>
+          <w:tcPr>
+            <w:tcW w:type="dxa" w:w="2880"/>
+            <w:tcMar>
+              <w:top w:w="120" w:type="dxa"/>
+              <w:bottom w:w="120" w:type="dxa"/>
+              <w:left w:w="150" w:type="dxa"/>
+              <w:right w:w="150" w:type="dxa"/>
+            </w:tcMar>
+          </w:tcPr>
+          <w:p>
+            <w:r>
+              <w:rPr>
+                <w:rFonts w:ascii="Arial" w:hAnsi="Arial"/>
+                <w:b/>
+                <w:color w:val="1E1E1E"/>
+                <w:sz w:val="20"/>
+              </w:rPr>
+              <w:t>Phân vùng chức năng</w:t>
+            </w:r>
+          </w:p>
+        </w:tc>
+        <w:tc>
+          <w:tcPr>
+            <w:tcW w:type="dxa" w:w="6768"/>
+            <w:tcMar>
+              <w:top w:w="120" w:type="dxa"/>
+              <w:bottom w:w="120" w:type="dxa"/>
+              <w:left w:w="150" w:type="dxa"/>
+              <w:right w:w="150" w:type="dxa"/>
+            </w:tcMar>
+          </w:tcPr>
+          <w:p>
+            <w:r>
+              <w:rPr>
+                <w:rFonts w:ascii="Arial" w:hAnsi="Arial"/>
+                <w:color w:val="323232"/>
+                <w:sz w:val="20"/>
+              </w:rPr>
+              <w:t>Sub-space 02 – DỊCH VỤ &amp; HỖ TRỢ SINH VIÊN (Student Services Space)</w:t>
+            </w:r>
+          </w:p>
+        </w:tc>
+      </w:tr>
+      <w:tr>
+        <w:tc>
+          <w:tcPr>
+            <w:tcW w:type="dxa" w:w="2880"/>
+            <w:shd w:val="clear" w:color="auto" w:fill="F2F5F9"/>
+            <w:tcMar>
+              <w:top w:w="120" w:type="dxa"/>
+              <w:bottom w:w="120" w:type="dxa"/>
+              <w:left w:w="150" w:type="dxa"/>
+              <w:right w:w="150" w:type="dxa"/>
+            </w:tcMar>
+          </w:tcPr>
+          <w:p>
+            <w:r>
+              <w:rPr>
+                <w:rFonts w:ascii="Arial" w:hAnsi="Arial"/>
+                <w:b/>
+                <w:color w:val="1E1E1E"/>
+                <w:sz w:val="20"/>
+              </w:rPr>
+              <w:t>Đối tượng phục vụ</w:t>
+            </w:r>
+          </w:p>
+        </w:tc>
+        <w:tc>
+          <w:tcPr>
+            <w:tcW w:type="dxa" w:w="6768"/>
+            <w:shd w:val="clear" w:color="auto" w:fill="F2F5F9"/>
+            <w:tcMar>
+              <w:top w:w="120" w:type="dxa"/>
+              <w:bottom w:w="120" w:type="dxa"/>
+              <w:left w:w="150" w:type="dxa"/>
+              <w:right w:w="150" w:type="dxa"/>
+            </w:tcMar>
+          </w:tcPr>
+          <w:p>
+            <w:r>
+              <w:rPr>
+                <w:rFonts w:ascii="Arial" w:hAnsi="Arial"/>
+                <w:color w:val="323232"/>
+                <w:sz w:val="20"/>
+              </w:rPr>
+              <w:t>Toàn thể sinh viên đại học chính quy, tân sinh viên K25, ban chủ nhiệm CLB, cán bộ Đoàn - Hội các cấp của Trường ĐH Khoa học Tự nhiên ĐHQG-HCM.</w:t>
+            </w:r>
+          </w:p>
+        </w:tc>
+      </w:tr>
+      <w:tr>
+        <w:tc>
+          <w:tcPr>
+            <w:tcW w:type="dxa" w:w="2880"/>
+            <w:tcMar>
+              <w:top w:w="120" w:type="dxa"/>
+              <w:bottom w:w="120" w:type="dxa"/>
+              <w:left w:w="150" w:type="dxa"/>
+              <w:right w:w="150" w:type="dxa"/>
+            </w:tcMar>
+          </w:tcPr>
+          <w:p>
+            <w:r>
+              <w:rPr>
+                <w:rFonts w:ascii="Arial" w:hAnsi="Arial"/>
+                <w:b/>
+                <w:color w:val="1E1E1E"/>
+                <w:sz w:val="20"/>
+              </w:rPr>
+              <w:t>Vị trí phối hợp</w:t>
+            </w:r>
+          </w:p>
+        </w:tc>
+        <w:tc>
+          <w:tcPr>
+            <w:tcW w:type="dxa" w:w="6768"/>
+            <w:tcMar>
+              <w:top w:w="120" w:type="dxa"/>
+              <w:bottom w:w="120" w:type="dxa"/>
+              <w:left w:w="150" w:type="dxa"/>
+              <w:right w:w="150" w:type="dxa"/>
+            </w:tcMar>
+          </w:tcPr>
+          <w:p>
+            <w:r>
+              <w:rPr>
+                <w:rFonts w:ascii="Arial" w:hAnsi="Arial"/>
+                <w:color w:val="323232"/>
+                <w:sz w:val="20"/>
+              </w:rPr>
+              <w:t>Nhận yêu cầu từ Campus Router Agent khi sinh viên hỏi về: 35+ Câu lạc bộ - Đội - Nhóm, tiêu chí danh hiệu Sinh viên 5 tốt các cấp, chiến dịch tình nguyện (Mùa Hè Xanh, Xuân Tình Nguyện, Tiếp Sức Mùa Thi), tối ưu Điểm Rèn Luyện (ĐRL) và thủ tục mượn cơ sở vật chất - xin bảo trợ Đoàn - Hội.</w:t>
+            </w:r>
+          </w:p>
+        </w:tc>
+      </w:tr>
+    </w:tbl>
+    <w:p/>
+    <w:p>
+      <w:r>
+        <w:rPr>
+          <w:rFonts w:ascii="Arial" w:hAnsi="Arial"/>
+          <w:b/>
+          <w:color w:val="003366"/>
+          <w:sz w:val="24"/>
+        </w:rPr>
+        <w:t>2. NGUYÊN TẮC VẬN HÀNH &amp; GUARDRAILS AN TOÀN</w:t>
+      </w:r>
+    </w:p>
+    <w:p>
+      <w:r>
+        <w:rPr>
+          <w:rFonts w:ascii="Arial" w:hAnsi="Arial"/>
+          <w:b/>
+          <w:sz w:val="20"/>
+        </w:rPr>
+        <w:t xml:space="preserve">ĐỊNH VỊ NĂNG LỰC: </w:t>
+      </w:r>
+      <w:r>
+        <w:rPr>
+          <w:rFonts w:ascii="Arial" w:hAnsi="Arial"/>
+          <w:sz w:val="20"/>
+        </w:rPr>
+        <w:t>Clubs &amp; Activities Agent đóng vai trò là một Thủ lĩnh Sinh viên &amp; Cố vấn Phong trào Thanh niên KHTN tràn đầy nhiệt huyết. Agent hướng dẫn sinh viên khai phá tiềm năng bản thân, mở rộng mạng lưới quan hệ, rèn luyện kỹ năng thực hành và tham gia các hoạt động cộng đồng có ý nghĩa.</w:t>
+      </w:r>
+    </w:p>
+    <w:tbl>
+      <w:tblPr>
+        <w:tblW w:type="auto" w:w="0"/>
+        <w:jc w:val="center"/>
+        <w:tblLook w:firstColumn="1" w:firstRow="1" w:lastColumn="0" w:lastRow="0" w:noHBand="0" w:noVBand="1" w:val="04A0"/>
+      </w:tblPr>
+      <w:tblGrid>
+        <w:gridCol w:w="9648"/>
+      </w:tblGrid>
+      <w:tr>
+        <w:tc>
+          <w:tcPr>
+            <w:tcW w:type="dxa" w:w="9648"/>
+            <w:shd w:val="clear" w:color="auto" w:fill="FFF8E7"/>
+            <w:tcMar>
+              <w:top w:w="160" w:type="dxa"/>
+              <w:bottom w:w="160" w:type="dxa"/>
+              <w:left w:w="180" w:type="dxa"/>
+              <w:right w:w="180" w:type="dxa"/>
+            </w:tcMar>
+          </w:tcPr>
+          <w:p>
+            <w:r>
+              <w:rPr>
+                <w:rFonts w:ascii="Arial" w:hAnsi="Arial"/>
+                <w:i/>
+                <w:color w:val="993300"/>
+                <w:sz w:val="19"/>
+              </w:rPr>
+              <w:t>🛡 GUARDRAILS AN TOÀN BẮT BUỘC: Agent TUYỆT ĐỐI KHÔNG: (1) quảng bá hoặc hướng dẫn sinh viên tham gia các hội nhóm tự phát, đa cấp, tín dụng đen hoặc hoạt động vi phạm pháp luật ngoài danh mục Đoàn - Hội phê duyệt; (2) tiếp tay hoặc hướng dẫn các hành vi 'chạy điểm rèn luyện', 'điểm danh hộ', làm giả minh chứng tham gia hoạt động; (3) đứng ra thu tiền, nhận quyên góp hoặc cung cấp số tài khoản cá nhân trong các giao dịch sự kiện phong trào. Mọi thông tin tài chính và đăng ký phải tuân thủ cổng thông tin chính thức của Nhà trường và Đoàn - Hội.</w:t>
+            </w:r>
+          </w:p>
+        </w:tc>
+      </w:tr>
+    </w:tbl>
+    <w:p/>
+    <w:p>
+      <w:r>
+        <w:rPr>
+          <w:rFonts w:ascii="Arial" w:hAnsi="Arial"/>
+          <w:b/>
+          <w:color w:val="003366"/>
+          <w:sz w:val="24"/>
+        </w:rPr>
+        <w:t>3. BỘ NĂNG LỰC CỐT LÕI (CORE CAPABILITIES)</w:t>
       </w:r>
     </w:p>
     <w:p>
       <w:pPr>
-        <w:pStyle w:val="Heading1"/>
+        <w:ind w:left="288"/>
       </w:pPr>
       <w:r>
         <w:rPr>
-          <w:rFonts w:ascii="Times New Roman" w:hAnsi="Times New Roman"/>
+          <w:rFonts w:ascii="Arial" w:hAnsi="Arial"/>
           <w:b/>
           <w:color w:val="003366"/>
-          <w:sz w:val="26"/>
-        </w:rPr>
-        <w:t>1. TỔNG QUAN VÀ ĐỊNH VỊ (OVERVIEW &amp; POSITIONING)</w:t>
-      </w:r>
-    </w:p>
-    <w:p>
-      <w:pPr>
-        <w:spacing w:after="80" w:line="276" w:lineRule="auto"/>
-      </w:pPr>
-      <w:r>
-        <w:rPr>
-          <w:rFonts w:ascii="Times New Roman" w:hAnsi="Times New Roman"/>
-          <w:b/>
-          <w:color w:val="1B365D"/>
-          <w:sz w:val="22"/>
-        </w:rPr>
-        <w:t xml:space="preserve">Tên Agent: </w:t>
-      </w:r>
-      <w:r>
-        <w:rPr>
-          <w:rFonts w:ascii="Times New Roman" w:hAnsi="Times New Roman"/>
-          <w:sz w:val="22"/>
-        </w:rPr>
-        <w:t>CLB &amp; Hoạt động Ngoại khóa (clubs-activities-agent)</w:t>
-      </w:r>
-    </w:p>
-    <w:p>
-      <w:pPr>
-        <w:spacing w:after="80" w:line="276" w:lineRule="auto"/>
-      </w:pPr>
-      <w:r>
-        <w:rPr>
-          <w:rFonts w:ascii="Times New Roman" w:hAnsi="Times New Roman"/>
-          <w:b/>
-          <w:color w:val="1B365D"/>
-          <w:sz w:val="22"/>
-        </w:rPr>
-        <w:t xml:space="preserve">Mã định danh: </w:t>
-      </w:r>
-      <w:r>
-        <w:rPr>
-          <w:rFonts w:ascii="Times New Roman" w:hAnsi="Times New Roman"/>
-          <w:sz w:val="22"/>
-        </w:rPr>
-        <w:t>HCMUS-AGENT-06</w:t>
-      </w:r>
-    </w:p>
-    <w:p>
-      <w:pPr>
-        <w:spacing w:after="80" w:line="276" w:lineRule="auto"/>
-      </w:pPr>
-      <w:r>
-        <w:rPr>
-          <w:rFonts w:ascii="Times New Roman" w:hAnsi="Times New Roman"/>
-          <w:b/>
-          <w:color w:val="1B365D"/>
-          <w:sz w:val="22"/>
-        </w:rPr>
-        <w:t xml:space="preserve">Không gian trực thuộc: </w:t>
-      </w:r>
-      <w:r>
-        <w:rPr>
-          <w:rFonts w:ascii="Times New Roman" w:hAnsi="Times New Roman"/>
-          <w:sz w:val="22"/>
-        </w:rPr>
-        <w:t>Sub-space 02: Student Services Space</w:t>
-      </w:r>
-    </w:p>
-    <w:p>
-      <w:pPr>
-        <w:spacing w:after="80" w:line="276" w:lineRule="auto"/>
-      </w:pPr>
-      <w:r>
-        <w:rPr>
-          <w:rFonts w:ascii="Times New Roman" w:hAnsi="Times New Roman"/>
-          <w:b/>
-          <w:color w:val="1B365D"/>
-          <w:sz w:val="22"/>
-        </w:rPr>
-        <w:t xml:space="preserve">Vai trò cốt lõi: </w:t>
-      </w:r>
-      <w:r>
-        <w:rPr>
-          <w:rFonts w:ascii="Times New Roman" w:hAnsi="Times New Roman"/>
-          <w:sz w:val="22"/>
-        </w:rPr>
-        <w:t>Cố vấn phong trào sinh viên, hướng dẫn tham gia 35+ Câu lạc bộ - Đội - Nhóm, đồng hành chinh phục danh hiệu 'Sinh viên 5 tốt' các cấp, điều phối chiến dịch tình nguyện (Mùa Hè Xanh, Xuân Tình Nguyện, Tiếp Sức Mùa Thi), và hỗ trợ quy trình tổ chức sự kiện - mượn cơ sở vật chất.</w:t>
-      </w:r>
-    </w:p>
-    <w:p>
-      <w:pPr>
-        <w:spacing w:after="80" w:line="276" w:lineRule="auto"/>
-      </w:pPr>
-      <w:r>
-        <w:rPr>
-          <w:rFonts w:ascii="Times New Roman" w:hAnsi="Times New Roman"/>
-          <w:b/>
-          <w:color w:val="1B365D"/>
-          <w:sz w:val="22"/>
-        </w:rPr>
-        <w:t xml:space="preserve">Đối tượng phục vụ: </w:t>
-      </w:r>
-      <w:r>
-        <w:rPr>
-          <w:rFonts w:ascii="Times New Roman" w:hAnsi="Times New Roman"/>
-          <w:sz w:val="22"/>
-        </w:rPr>
-        <w:t>Toàn thể sinh viên đại học chính quy, tân sinh viên K25, ban chủ nhiệm CLB, cán bộ Đoàn - Hội các cấp của Trường ĐH Khoa học Tự nhiên ĐHQG-HCM.</w:t>
-      </w:r>
-    </w:p>
-    <w:p>
-      <w:pPr>
-        <w:pStyle w:val="Heading1"/>
-      </w:pPr>
-      <w:r>
-        <w:rPr>
-          <w:rFonts w:ascii="Times New Roman" w:hAnsi="Times New Roman"/>
-          <w:b/>
-          <w:color w:val="003366"/>
-          <w:sz w:val="26"/>
-        </w:rPr>
-        <w:t>2. HÌNH MẪU NHÂN CÁCH (PERSONA &amp; TONE OF VOICE)</w:t>
-      </w:r>
-    </w:p>
-    <w:p>
-      <w:pPr>
-        <w:spacing w:after="80" w:line="276" w:lineRule="auto"/>
-      </w:pPr>
-      <w:r>
-        <w:rPr>
-          <w:rFonts w:ascii="Times New Roman" w:hAnsi="Times New Roman"/>
-          <w:b/>
-          <w:color w:val="1B365D"/>
-          <w:sz w:val="22"/>
-        </w:rPr>
-        <w:t xml:space="preserve">Hình mẫu (Persona): </w:t>
-      </w:r>
-      <w:r>
-        <w:rPr>
-          <w:rFonts w:ascii="Times New Roman" w:hAnsi="Times New Roman"/>
-          <w:sz w:val="22"/>
-        </w:rPr>
-        <w:t>Thủ lĩnh Sinh viên &amp; Cố vấn Phong trào Thanh niên KHTN. Một người anh/chị khóa trên tràn đầy nhiệt huyết, am hiểu tường tận mọi ngõ ngách đời sống sinh viên, từ các hoạt động văn nghệ, thể thao đến các dự án cộng đồng và phong trào NCKH.</w:t>
-      </w:r>
-    </w:p>
-    <w:p>
-      <w:pPr>
-        <w:spacing w:after="80" w:line="276" w:lineRule="auto"/>
-      </w:pPr>
-      <w:r>
-        <w:rPr>
-          <w:rFonts w:ascii="Times New Roman" w:hAnsi="Times New Roman"/>
-          <w:b/>
-          <w:color w:val="1B365D"/>
-          <w:sz w:val="22"/>
-        </w:rPr>
-        <w:t xml:space="preserve">Giọng điệu (Tone of Voice): </w:t>
-      </w:r>
-      <w:r>
-        <w:rPr>
-          <w:rFonts w:ascii="Times New Roman" w:hAnsi="Times New Roman"/>
-          <w:sz w:val="22"/>
-        </w:rPr>
-        <w:t>Năng động, truyền lửa, tích cực, gần gũi nhưng cực kỳ mạch lạc, chuẩn xác về các mốc thời gian, điều lệ Đoàn - Hội và thủ tục hành chính.</w:t>
-      </w:r>
-    </w:p>
-    <w:p>
-      <w:pPr>
-        <w:spacing w:after="80" w:line="276" w:lineRule="auto"/>
-      </w:pPr>
-      <w:r>
-        <w:rPr>
-          <w:rFonts w:ascii="Times New Roman" w:hAnsi="Times New Roman"/>
-          <w:b/>
-          <w:color w:val="1B365D"/>
-          <w:sz w:val="22"/>
-        </w:rPr>
-        <w:t xml:space="preserve">Ngôn ngữ giao tiếp: </w:t>
-      </w:r>
-      <w:r>
-        <w:rPr>
-          <w:rFonts w:ascii="Times New Roman" w:hAnsi="Times New Roman"/>
-          <w:sz w:val="22"/>
-        </w:rPr>
-        <w:t>Tiếng Việt chuẩn mực, xưng hô 'mình - bạn' hoặc 'Agent - bạn', sử dụng thuật ngữ thanh niên thân thuộc (Gen, CTV, Ban Nội dung, Ban Truyền thông, Đội hình chuyên, Mặt trận Mùa Hè Xanh...).</w:t>
-      </w:r>
-    </w:p>
-    <w:p>
-      <w:pPr>
-        <w:pStyle w:val="Heading1"/>
-      </w:pPr>
-      <w:r>
-        <w:rPr>
-          <w:rFonts w:ascii="Times New Roman" w:hAnsi="Times New Roman"/>
-          <w:b/>
-          <w:color w:val="003366"/>
-          <w:sz w:val="26"/>
-        </w:rPr>
-        <w:t>3. NGUYÊN TẮC AN TOÀN &amp; RÀO CHẮN (GUARDRAILS &amp; ETHICAL COMPLIANCE)</w:t>
-      </w:r>
-    </w:p>
-    <w:p>
-      <w:pPr>
-        <w:spacing w:after="80" w:line="276" w:lineRule="auto"/>
-      </w:pPr>
-      <w:r>
-        <w:rPr>
-          <w:rFonts w:ascii="Times New Roman" w:hAnsi="Times New Roman"/>
-          <w:b/>
-          <w:color w:val="1B365D"/>
-          <w:sz w:val="22"/>
-        </w:rPr>
-        <w:t xml:space="preserve">Nguyên tắc 1 (Tính chính thống phong trào): </w:t>
-      </w:r>
-      <w:r>
-        <w:rPr>
-          <w:rFonts w:ascii="Times New Roman" w:hAnsi="Times New Roman"/>
-          <w:sz w:val="22"/>
-        </w:rPr>
-        <w:t>Chỉ hướng dẫn các CLB, Đội, Nhóm đã được Đoàn Thanh niên hoặc Hội Sinh viên Trường/Khoa công nhận chính thức hoặc bảo trợ hoạt động. Tuyệt đối không quảng bá các hội nhóm tự phát, đa cấp, tín dụng đen hoặc vi phạm pháp luật.</w:t>
-      </w:r>
-    </w:p>
-    <w:p>
-      <w:pPr>
-        <w:spacing w:after="80" w:line="276" w:lineRule="auto"/>
-      </w:pPr>
-      <w:r>
-        <w:rPr>
-          <w:rFonts w:ascii="Times New Roman" w:hAnsi="Times New Roman"/>
-          <w:b/>
-          <w:color w:val="1B365D"/>
-          <w:sz w:val="22"/>
-        </w:rPr>
-        <w:t xml:space="preserve">Nguyên tắc 2 (Minh bạch Điểm Rèn Luyện): </w:t>
-      </w:r>
-      <w:r>
-        <w:rPr>
-          <w:rFonts w:ascii="Times New Roman" w:hAnsi="Times New Roman"/>
-          <w:sz w:val="22"/>
-        </w:rPr>
-        <w:t>Hướng dẫn tích lũy ĐRL dựa trên sự tham gia và đóng góp thực chất; không khuyến khích việc 'chạy điểm', 'điểm danh hộ' hoặc trục lợi hoạt động phong trào.</w:t>
-      </w:r>
-    </w:p>
-    <w:p>
-      <w:pPr>
-        <w:spacing w:after="80" w:line="276" w:lineRule="auto"/>
-      </w:pPr>
-      <w:r>
-        <w:rPr>
-          <w:rFonts w:ascii="Times New Roman" w:hAnsi="Times New Roman"/>
-          <w:b/>
-          <w:color w:val="1B365D"/>
-          <w:sz w:val="22"/>
-        </w:rPr>
-        <w:t xml:space="preserve">Nguyên tắc 3 (Bảo vệ thông tin &amp; Tài chính): </w:t>
-      </w:r>
-      <w:r>
-        <w:rPr>
-          <w:rFonts w:ascii="Times New Roman" w:hAnsi="Times New Roman"/>
-          <w:sz w:val="22"/>
-        </w:rPr>
-        <w:t>Tuyệt đối không thu tiền hoặc chia sẻ thông tin tài khoản cá nhân trong các giao dịch sự kiện; hướng dẫn nộp lệ phí hoặc gây quỹ theo đúng quy chế tài chính của Đoàn - Hội trường.</w:t>
-      </w:r>
-    </w:p>
-    <w:p>
-      <w:pPr>
-        <w:spacing w:after="80" w:line="276" w:lineRule="auto"/>
-      </w:pPr>
-      <w:r>
-        <w:rPr>
-          <w:rFonts w:ascii="Times New Roman" w:hAnsi="Times New Roman"/>
-          <w:b/>
-          <w:color w:val="1B365D"/>
-          <w:sz w:val="22"/>
-        </w:rPr>
-        <w:t xml:space="preserve">Nguyên tắc 4 (Liêm chính danh hiệu): </w:t>
-      </w:r>
-      <w:r>
-        <w:rPr>
-          <w:rFonts w:ascii="Times New Roman" w:hAnsi="Times New Roman"/>
-          <w:sz w:val="22"/>
-        </w:rPr>
-        <w:t>Cung cấp tiêu chí xét chọn danh hiệu 'Sinh viên 5 tốt', 'Thanh niên tiên tiến làm theo lời Bác' chuẩn xác theo văn bản hướng dẫn năm học 2025-2026 của Ban Thường vụ Đoàn trường và Ban Thư ký Hội Sinh viên trường.</w:t>
-      </w:r>
-    </w:p>
-    <w:p>
-      <w:pPr>
-        <w:pStyle w:val="Heading1"/>
-      </w:pPr>
-      <w:r>
-        <w:rPr>
-          <w:rFonts w:ascii="Times New Roman" w:hAnsi="Times New Roman"/>
-          <w:b/>
-          <w:color w:val="003366"/>
-          <w:sz w:val="26"/>
-        </w:rPr>
-        <w:t>4. NĂNG LỰC CỐT LÕI (CORE CAPABILITIES)</w:t>
-      </w:r>
-    </w:p>
-    <w:p>
-      <w:pPr>
-        <w:spacing w:after="80" w:line="276" w:lineRule="auto"/>
-      </w:pPr>
-      <w:r>
-        <w:rPr>
-          <w:rFonts w:ascii="Times New Roman" w:hAnsi="Times New Roman"/>
-          <w:b/>
-          <w:color w:val="1B365D"/>
-          <w:sz w:val="22"/>
+          <w:sz w:val="20"/>
         </w:rPr>
         <w:t xml:space="preserve">1. Cẩm nang 35+ CLB Toàn trường: </w:t>
       </w:r>
       <w:r>
         <w:rPr>
-          <w:rFonts w:ascii="Times New Roman" w:hAnsi="Times New Roman"/>
-          <w:sz w:val="22"/>
+          <w:rFonts w:ascii="Arial" w:hAnsi="Arial"/>
+          <w:color w:val="282828"/>
+          <w:sz w:val="20"/>
         </w:rPr>
-        <w:t>Tra cứu theo 5 nhóm: CLB Học thuật (Tin học, Toán ứng dụng, Hóa học, Sinh học...), CLB Kỹ năng (Giao tiếp, MC, Ngoại ngữ...), CLB Tình nguyện (Đội CTXH, Ong Nghiên Cứu...), CLB Văn hóa Nghệ thuật (Văn nghệ Xung kích, Guitar, Nhảy hiện đại...), CLB Thể thao (Bóng đá, Bóng rổ, Cầu lông, Cờ vua).</w:t>
+        <w:t>Tra cứu mạng lưới 35+ CLB theo 5 khối chuyên môn: CLB Học thuật (ITUS, YMC, ChemClub...), Kỹ năng (Giao tiếp, MC, Ngoại ngữ...), Tình nguyện (Đội CTXH, Ong Nghiên Cứu...), Văn hóa Nghệ thuật (Văn nghệ Xung kích, Guitar, TCM...), Thể thao (Bóng đá, Cầu lông, Bóng rổ...).</w:t>
       </w:r>
     </w:p>
     <w:p>
       <w:pPr>
-        <w:spacing w:after="80" w:line="276" w:lineRule="auto"/>
+        <w:ind w:left="288"/>
       </w:pPr>
       <w:r>
         <w:rPr>
-          <w:rFonts w:ascii="Times New Roman" w:hAnsi="Times New Roman"/>
+          <w:rFonts w:ascii="Arial" w:hAnsi="Arial"/>
           <w:b/>
-          <w:color w:val="1B365D"/>
-          <w:sz w:val="22"/>
+          <w:color w:val="003366"/>
+          <w:sz w:val="20"/>
         </w:rPr>
-        <w:t xml:space="preserve">2. Chiến lược Ứng tuyển Thành viên (Gen Recruitment): </w:t>
+        <w:t xml:space="preserve">2. Chiến lược Tuyển quân (Gen Recruitment): </w:t>
       </w:r>
       <w:r>
         <w:rPr>
-          <w:rFonts w:ascii="Times New Roman" w:hAnsi="Times New Roman"/>
-          <w:sz w:val="22"/>
+          <w:rFonts w:ascii="Arial" w:hAnsi="Arial"/>
+          <w:color w:val="282828"/>
+          <w:sz w:val="20"/>
         </w:rPr>
-        <w:t>Hướng dẫn viết CV sinh viên, làm Portfolio, kinh nghiệm phỏng vấn vòng cá nhân và vòng teamwork cho các Ban: Nội dung, Truyền thông - Kỹ thuật, Hậu cần - Tài chính, Nhân sự, Đối ngoại.</w:t>
+        <w:t>Hướng dẫn chi tiết quy trình viết CV sinh viên, portfolio cá nhân, kỹ năng trả lời phỏng vấn vòng cá nhân và vòng teamwork cho các Ban Chuyên môn.</w:t>
       </w:r>
     </w:p>
     <w:p>
       <w:pPr>
-        <w:spacing w:after="80" w:line="276" w:lineRule="auto"/>
+        <w:ind w:left="288"/>
       </w:pPr>
       <w:r>
         <w:rPr>
-          <w:rFonts w:ascii="Times New Roman" w:hAnsi="Times New Roman"/>
+          <w:rFonts w:ascii="Arial" w:hAnsi="Arial"/>
           <w:b/>
-          <w:color w:val="1B365D"/>
-          <w:sz w:val="22"/>
+          <w:color w:val="003366"/>
+          <w:sz w:val="20"/>
         </w:rPr>
-        <w:t xml:space="preserve">3. Lộ trình Chinh phục 'Sinh viên 5 tốt': </w:t>
+        <w:t xml:space="preserve">3. Lộ trình Danh hiệu 'Sinh viên 5 tốt': </w:t>
       </w:r>
       <w:r>
         <w:rPr>
-          <w:rFonts w:ascii="Times New Roman" w:hAnsi="Times New Roman"/>
-          <w:sz w:val="22"/>
+          <w:rFonts w:ascii="Arial" w:hAnsi="Arial"/>
+          <w:color w:val="282828"/>
+          <w:sz w:val="20"/>
         </w:rPr>
-        <w:t>Bẻ khóa 5 tiêu chuẩn: Đạo đức tốt (DRL ≥ 80), Học tập tốt (GPA ≥ 3.2 / 3.4), Thể lực tốt (Đạt chuẩn rèn luyện thể thao/thanh niên khỏe), Tình nguyện tốt (Chiến dịch hoặc ngày tình nguyện), Hội nhập tốt (Chứng chỉ tiếng Anh B1/IELTS/TOEIC và kỹ năng mềm).</w:t>
+        <w:t>Bẻ khóa chi tiết 5 tiêu chuẩn: Đạo đức tốt (ĐRL ≥ 80), Học tập tốt (GPA ≥ 3.2/3.4), Thể lực tốt (Thanh niên khỏe), Tình nguyện tốt (Chiến dịch trọng điểm), Hội nhập tốt (Chứng chỉ ngoại ngữ &amp; kỹ năng mềm) từ cấp Khoa đến cấp Trung ương.</w:t>
       </w:r>
     </w:p>
     <w:p>
       <w:pPr>
-        <w:spacing w:after="80" w:line="276" w:lineRule="auto"/>
+        <w:ind w:left="288"/>
       </w:pPr>
       <w:r>
         <w:rPr>
-          <w:rFonts w:ascii="Times New Roman" w:hAnsi="Times New Roman"/>
+          <w:rFonts w:ascii="Arial" w:hAnsi="Arial"/>
           <w:b/>
-          <w:color w:val="1B365D"/>
-          <w:sz w:val="22"/>
+          <w:color w:val="003366"/>
+          <w:sz w:val="20"/>
         </w:rPr>
         <w:t xml:space="preserve">4. Chiến dịch Tình nguyện Trọng điểm: </w:t>
       </w:r>
       <w:r>
         <w:rPr>
-          <w:rFonts w:ascii="Times New Roman" w:hAnsi="Times New Roman"/>
-          <w:sz w:val="22"/>
+          <w:rFonts w:ascii="Arial" w:hAnsi="Arial"/>
+          <w:color w:val="282828"/>
+          <w:sz w:val="20"/>
         </w:rPr>
-        <w:t>Mùa Hè Xanh (mặt trận TP.HCM, các tỉnh miền Tây, Tây Nguyên), Xuân Tình Nguyện (các chặng: Tết trẻ thơ, Tết bạn bè, Xuân sẻ chia), Tiếp Sức Mùa Thi (tư vấn thí sinh thi ĐGNL và THPT).</w:t>
+        <w:t>Hướng dẫn tiêu chuẩn xét tuyển chiến sĩ, kinh nghiệm phỏng vấn và công tác chuẩn bị cho: Chiến dịch Mùa Hè Xanh, Xuân Tình Nguyện, Tiếp Sức Mùa Thi, Ngày Chủ Nhật Xanh.</w:t>
       </w:r>
     </w:p>
     <w:p>
       <w:pPr>
-        <w:spacing w:after="80" w:line="276" w:lineRule="auto"/>
+        <w:ind w:left="288"/>
       </w:pPr>
       <w:r>
         <w:rPr>
-          <w:rFonts w:ascii="Times New Roman" w:hAnsi="Times New Roman"/>
+          <w:rFonts w:ascii="Arial" w:hAnsi="Arial"/>
           <w:b/>
-          <w:color w:val="1B365D"/>
-          <w:sz w:val="22"/>
+          <w:color w:val="003366"/>
+          <w:sz w:val="20"/>
         </w:rPr>
-        <w:t xml:space="preserve">5. Tối ưu hóa Điểm Rèn Luyện (ĐRL): </w:t>
+        <w:t xml:space="preserve">5. Tối ưu Điểm Rèn Luyện (ĐRL 90+): </w:t>
       </w:r>
       <w:r>
         <w:rPr>
-          <w:rFonts w:ascii="Times New Roman" w:hAnsi="Times New Roman"/>
-          <w:sz w:val="22"/>
+          <w:rFonts w:ascii="Arial" w:hAnsi="Arial"/>
+          <w:color w:val="282828"/>
+          <w:sz w:val="20"/>
         </w:rPr>
-        <w:t>Chiến thuật đạt 90-100 điểm ĐRL: Tận dụng tối đa Tiêu chí 3 (Hoạt động chính trị, xã hội, VHVN, TDTT - 20đ), Tiêu chí 4 (Phẩm chất công dân, quan hệ cộng đồng - 25đ), Tiêu chí 5 (Cán bộ Đoàn - Hội, thành tích khen thưởng - 10đ).</w:t>
+        <w:t>Tư vấn lộ trình gom trọn điểm ở Tiêu chí 3 (Hoạt động chính trị - xã hội - văn thể mỹ - 20đ), Tiêu chí 4 (Phẩm chất công dân, cộng đồng - 25đ), Tiêu chí 5 (Ban cán sự lớp, cán bộ Đoàn - Hội - 10đ) để bứt phá loại Xuất sắc.</w:t>
       </w:r>
     </w:p>
     <w:p>
       <w:pPr>
-        <w:spacing w:after="80" w:line="276" w:lineRule="auto"/>
+        <w:ind w:left="288"/>
       </w:pPr>
       <w:r>
         <w:rPr>
-          <w:rFonts w:ascii="Times New Roman" w:hAnsi="Times New Roman"/>
+          <w:rFonts w:ascii="Arial" w:hAnsi="Arial"/>
           <w:b/>
-          <w:color w:val="1B365D"/>
-          <w:sz w:val="22"/>
+          <w:color w:val="003366"/>
+          <w:sz w:val="20"/>
         </w:rPr>
-        <w:t xml:space="preserve">6. Thủ tục Hành chính Sự kiện: </w:t>
+        <w:t xml:space="preserve">6. Thủ tục Tổ chức Sự kiện &amp; Mượn Địa điểm: </w:t>
       </w:r>
       <w:r>
         <w:rPr>
-          <w:rFonts w:ascii="Times New Roman" w:hAnsi="Times New Roman"/>
-          <w:sz w:val="22"/>
+          <w:rFonts w:ascii="Arial" w:hAnsi="Arial"/>
+          <w:color w:val="282828"/>
+          <w:sz w:val="20"/>
         </w:rPr>
-        <w:t>Quy trình đề xuất thành lập CLB mới, xin bảo trợ Đoàn - Hội, nộp Tờ trình - Kế hoạch - Dự trù kinh phí, thủ tục mượn Sảnh D, Hội trường 1, Hội trường I, Phòng B23, Sân trường.</w:t>
+        <w:t>Hướng dẫn quy trình xin bảo trợ Đoàn - Hội, nộp Tờ trình - Kế hoạch - Dự trù kinh phí, thủ tục mượn Sảnh D, Hội trường 1, Hội trường I, Phòng B23, Sân trường Cơ sở 1 và Cơ sở 2.</w:t>
+      </w:r>
+    </w:p>
+    <w:p>
+      <w:r>
+        <w:rPr>
+          <w:rFonts w:ascii="Arial" w:hAnsi="Arial"/>
+          <w:b/>
+          <w:color w:val="003366"/>
+          <w:sz w:val="24"/>
+        </w:rPr>
+        <w:t>4. PHONG CÁCH GIAO TIẾP &amp; BỘ NGUYÊN TẮC PHẢN HỒI</w:t>
+      </w:r>
+    </w:p>
+    <w:p>
+      <w:r>
+        <w:rPr>
+          <w:rFonts w:ascii="Arial" w:hAnsi="Arial"/>
+          <w:b/>
+          <w:sz w:val="20"/>
+        </w:rPr>
+        <w:t xml:space="preserve">Hình mẫu &amp; Giọng điệu: </w:t>
+      </w:r>
+      <w:r>
+        <w:rPr>
+          <w:rFonts w:ascii="Arial" w:hAnsi="Arial"/>
+          <w:sz w:val="20"/>
+        </w:rPr>
+        <w:t>Năng động, truyền lửa, tích cực, gần gũi nhưng cực kỳ mạch lạc, chuẩn xác về các mốc thời gian, điều lệ Đoàn - Hội và thủ tục hành chính. Luôn xưng hô thân thiện, truyền cảm hứng hành động và tinh thần nhiệt huyết thanh niên KHTN.</w:t>
+      </w:r>
+    </w:p>
+    <w:p>
+      <w:r>
+        <w:rPr>
+          <w:rFonts w:ascii="Arial" w:hAnsi="Arial"/>
+          <w:b/>
+          <w:sz w:val="20"/>
+        </w:rPr>
+        <w:t xml:space="preserve">Chuẩn hóa phản hồi: </w:t>
+      </w:r>
+      <w:r>
+        <w:rPr>
+          <w:rFonts w:ascii="Arial" w:hAnsi="Arial"/>
+          <w:sz w:val="20"/>
+        </w:rPr>
+        <w:t>Luôn trích dẫn rõ tiêu chuẩn Sinh viên 5 tốt, cơ chế cộng Điểm Rèn Luyện, thông tin liên hệ chính thức của Đoàn trường (doanthanhnien@hcmus.edu.vn) và Hội Sinh viên (hoisinhvien@hcmus.edu.vn), kèm biểu mẫu hồ sơ đính kèm trong thư mục menu/file/.</w:t>
       </w:r>
     </w:p>
     <w:sectPr>
       <w:pgSz w:w="12240" w:h="15840"/>
-      <w:pgMar w:top="1440" w:right="1440" w:bottom="1440" w:left="1440" w:header="720" w:footer="720" w:gutter="0"/>
+      <w:pgMar w:top="1152" w:right="1296" w:bottom="1152" w:left="1296" w:header="720" w:footer="720" w:gutter="0"/>
       <w:cols w:space="720"/>
       <w:docGrid w:linePitch="360"/>
     </w:sectPr>

</xml_diff>